<commit_message>
docs: finalize data understanding report and sync jupyter notebook metrics
</commit_message>
<xml_diff>
--- a/reports/Problem_Statement_Document.docx
+++ b/reports/Problem_Statement_Document.docx
@@ -18,7 +18,7 @@
           <w:sz w:val="48"/>
           <w:szCs w:val="48"/>
         </w:rPr>
-        <w:t>Problem Statement Document</w:t>
+        <w:t>Customer Churn Prediction System</w:t>
       </w:r>
     </w:p>
     <w:p>
@@ -27,17 +27,34 @@
         <w:jc w:val="center"/>
         <w:rPr>
           <w:color w:val="0F4761" w:themeColor="accent1" w:themeShade="BF"/>
-          <w:sz w:val="30"/>
-          <w:szCs w:val="30"/>
+          <w:sz w:val="32"/>
+          <w:szCs w:val="32"/>
         </w:rPr>
       </w:pPr>
       <w:r>
         <w:rPr>
           <w:color w:val="0F4761" w:themeColor="accent1" w:themeShade="BF"/>
-          <w:sz w:val="30"/>
-          <w:szCs w:val="30"/>
+          <w:sz w:val="32"/>
+          <w:szCs w:val="32"/>
         </w:rPr>
-        <w:t>Customer Churn Prediction System</w:t>
+        <w:t>Problem Statement Document</w:t>
+      </w:r>
+    </w:p>
+    <w:p>
+      <w:pPr>
+        <w:spacing w:after="80"/>
+        <w:jc w:val="center"/>
+        <w:rPr>
+          <w:sz w:val="24"/>
+          <w:szCs w:val="24"/>
+        </w:rPr>
+      </w:pPr>
+      <w:r>
+        <w:rPr>
+          <w:sz w:val="24"/>
+          <w:szCs w:val="24"/>
+        </w:rPr>
+        <w:t>Phase 1 : Business Understanding</w:t>
       </w:r>
     </w:p>
     <w:p>
@@ -80,6 +97,9 @@
         <w:gridCol w:w="7020"/>
       </w:tblGrid>
       <w:tr>
+        <w:trPr>
+          <w:trHeight w:val="558"/>
+        </w:trPr>
         <w:tc>
           <w:tcPr>
             <w:tcW w:w="2340" w:type="dxa"/>
@@ -348,11 +368,6 @@
     </w:p>
     <w:p>
       <w:pPr>
-        <w:spacing w:before="100" w:after="100"/>
-      </w:pPr>
-    </w:p>
-    <w:p>
-      <w:pPr>
         <w:pStyle w:val="Heading2"/>
       </w:pPr>
       <w:r>
@@ -500,16 +515,7 @@
         <w:pStyle w:val="Heading2"/>
       </w:pPr>
       <w:r>
-        <w:t>2.</w:t>
-      </w:r>
-      <w:r>
-        <w:t>4</w:t>
-      </w:r>
-      <w:r>
-        <w:t xml:space="preserve"> </w:t>
-      </w:r>
-      <w:r>
-        <w:t>Business Stakeholders</w:t>
+        <w:t>2.4 Business Stakeholders</w:t>
       </w:r>
     </w:p>
     <w:p>
@@ -696,10 +702,7 @@
         <w:pStyle w:val="Heading2"/>
       </w:pPr>
       <w:r>
-        <w:t xml:space="preserve">3.3 </w:t>
-      </w:r>
-      <w:r>
-        <w:t>Project Goals</w:t>
+        <w:t>3.3 Project Goals</w:t>
       </w:r>
     </w:p>
     <w:p>
@@ -861,16 +864,7 @@
         <w:pStyle w:val="Heading2"/>
       </w:pPr>
       <w:r>
-        <w:t>3.</w:t>
-      </w:r>
-      <w:r>
-        <w:t>4</w:t>
-      </w:r>
-      <w:r>
-        <w:t xml:space="preserve"> Project </w:t>
-      </w:r>
-      <w:r>
-        <w:t>Scope</w:t>
+        <w:t>3.4 Project Scope</w:t>
       </w:r>
     </w:p>
     <w:p>
@@ -980,12 +974,6 @@
         <w:gridCol w:w="4860"/>
       </w:tblGrid>
       <w:tr>
-        <w:tblPrEx>
-          <w:tblCellMar>
-            <w:top w:w="0" w:type="dxa"/>
-            <w:bottom w:w="0" w:type="dxa"/>
-          </w:tblCellMar>
-        </w:tblPrEx>
         <w:tc>
           <w:tcPr>
             <w:tcW w:w="2500" w:type="dxa"/>
@@ -1075,12 +1063,6 @@
         </w:tc>
       </w:tr>
       <w:tr>
-        <w:tblPrEx>
-          <w:tblCellMar>
-            <w:top w:w="0" w:type="dxa"/>
-            <w:bottom w:w="0" w:type="dxa"/>
-          </w:tblCellMar>
-        </w:tblPrEx>
         <w:tc>
           <w:tcPr>
             <w:tcW w:w="2500" w:type="dxa"/>
@@ -1165,12 +1147,6 @@
         </w:tc>
       </w:tr>
       <w:tr>
-        <w:tblPrEx>
-          <w:tblCellMar>
-            <w:top w:w="0" w:type="dxa"/>
-            <w:bottom w:w="0" w:type="dxa"/>
-          </w:tblCellMar>
-        </w:tblPrEx>
         <w:tc>
           <w:tcPr>
             <w:tcW w:w="2500" w:type="dxa"/>
@@ -1255,12 +1231,6 @@
         </w:tc>
       </w:tr>
       <w:tr>
-        <w:tblPrEx>
-          <w:tblCellMar>
-            <w:top w:w="0" w:type="dxa"/>
-            <w:bottom w:w="0" w:type="dxa"/>
-          </w:tblCellMar>
-        </w:tblPrEx>
         <w:tc>
           <w:tcPr>
             <w:tcW w:w="2500" w:type="dxa"/>
@@ -1355,16 +1325,7 @@
         <w:pStyle w:val="Heading2"/>
       </w:pPr>
       <w:r>
-        <w:t>4.</w:t>
-      </w:r>
-      <w:r>
-        <w:t>2</w:t>
-      </w:r>
-      <w:r>
-        <w:t xml:space="preserve"> </w:t>
-      </w:r>
-      <w:r>
-        <w:t>Business Success Criteria</w:t>
+        <w:t>4.2 Business Success Criteria</w:t>
       </w:r>
     </w:p>
     <w:p>
@@ -1393,16 +1354,7 @@
         <w:pStyle w:val="Heading2"/>
       </w:pPr>
       <w:r>
-        <w:t>4.</w:t>
-      </w:r>
-      <w:r>
-        <w:t>3</w:t>
-      </w:r>
-      <w:r>
-        <w:t xml:space="preserve"> </w:t>
-      </w:r>
-      <w:r>
-        <w:t>Project Risks and Limitations</w:t>
+        <w:t>4.3 Project Risks and Limitations</w:t>
       </w:r>
     </w:p>
     <w:p>
@@ -1494,10 +1446,7 @@
         </w:pBdr>
       </w:pPr>
       <w:r>
-        <w:t xml:space="preserve">4. </w:t>
-      </w:r>
-      <w:r>
-        <w:t>Conclusion</w:t>
+        <w:t>4. Conclusion</w:t>
       </w:r>
     </w:p>
     <w:p>
@@ -3517,6 +3466,7 @@
   <w:style w:type="character" w:default="1" w:styleId="DefaultParagraphFont">
     <w:name w:val="Default Paragraph Font"/>
     <w:uiPriority w:val="1"/>
+    <w:semiHidden/>
     <w:unhideWhenUsed/>
   </w:style>
   <w:style w:type="table" w:default="1" w:styleId="TableNormal">

</xml_diff>